<commit_message>
personal library (ver-2) update-153
</commit_message>
<xml_diff>
--- a/resources/Courses/GPT/DevOps Engineering.docx
+++ b/resources/Courses/GPT/DevOps Engineering.docx
@@ -1503,7 +1503,43 @@
                 <w:bCs/>
                 <w:color w:val="C00000"/>
               </w:rPr>
-              <w:t xml:space="preserve">Continuous Decurity (a.k.a. DevSecOps) </w:t>
+              <w:t xml:space="preserve">Continuous </w:t>
+            </w:r>
+            <w:proofErr w:type="spellStart"/>
+            <w:r>
+              <w:rPr>
+                <w:b/>
+                <w:bCs/>
+                <w:color w:val="C00000"/>
+              </w:rPr>
+              <w:t>Decurity</w:t>
+            </w:r>
+            <w:proofErr w:type="spellEnd"/>
+            <w:r>
+              <w:rPr>
+                <w:b/>
+                <w:bCs/>
+                <w:color w:val="C00000"/>
+              </w:rPr>
+              <w:t xml:space="preserve"> (a.k.a. </w:t>
+            </w:r>
+            <w:proofErr w:type="spellStart"/>
+            <w:r>
+              <w:rPr>
+                <w:b/>
+                <w:bCs/>
+                <w:color w:val="C00000"/>
+              </w:rPr>
+              <w:t>DevSecOps</w:t>
+            </w:r>
+            <w:proofErr w:type="spellEnd"/>
+            <w:r>
+              <w:rPr>
+                <w:b/>
+                <w:bCs/>
+                <w:color w:val="C00000"/>
+              </w:rPr>
+              <w:t xml:space="preserve">) </w:t>
             </w:r>
           </w:p>
         </w:tc>
@@ -2927,7 +2963,15 @@
           </w:tcPr>
           <w:p>
             <w:r>
-              <w:t xml:space="preserve">DevOps Multi-Cloud </w:t>
+              <w:t xml:space="preserve">DevOps </w:t>
+            </w:r>
+            <w:proofErr w:type="gramStart"/>
+            <w:r>
+              <w:t>Multi-Cloud</w:t>
+            </w:r>
+            <w:proofErr w:type="gramEnd"/>
+            <w:r>
+              <w:t xml:space="preserve"> </w:t>
             </w:r>
           </w:p>
         </w:tc>
@@ -4419,7 +4463,15 @@
           </w:tcPr>
           <w:p>
             <w:r>
-              <w:t xml:space="preserve">Why is the Realize Step Important to Engineering DeOps? </w:t>
+              <w:t xml:space="preserve">Why is the Realize Step Important to Engineering </w:t>
+            </w:r>
+            <w:proofErr w:type="spellStart"/>
+            <w:r>
+              <w:t>DeOps</w:t>
+            </w:r>
+            <w:proofErr w:type="spellEnd"/>
+            <w:r>
+              <w:t xml:space="preserve">? </w:t>
             </w:r>
           </w:p>
         </w:tc>
@@ -4979,8 +5031,13 @@
           </w:tcPr>
           <w:p>
             <w:r>
-              <w:t>Mastering DevOps Maturity Level 4 – Second Way (Continuous Feedback)…</w:t>
-            </w:r>
+              <w:t xml:space="preserve">Mastering DevOps Maturity Level 4 – Second Way (Continuous </w:t>
+            </w:r>
+            <w:proofErr w:type="gramStart"/>
+            <w:r>
+              <w:t>Feedback)…</w:t>
+            </w:r>
+            <w:proofErr w:type="gramEnd"/>
           </w:p>
         </w:tc>
       </w:tr>
@@ -5003,8 +5060,13 @@
           </w:tcPr>
           <w:p>
             <w:r>
-              <w:t>Mastering DevOps Maturity Level 5 – Third Way (Continuous Improvement)…</w:t>
-            </w:r>
+              <w:t xml:space="preserve">Mastering DevOps Maturity Level 5 – Third Way (Continuous </w:t>
+            </w:r>
+            <w:proofErr w:type="gramStart"/>
+            <w:r>
+              <w:t>Improvement)…</w:t>
+            </w:r>
+            <w:proofErr w:type="gramEnd"/>
           </w:p>
         </w:tc>
       </w:tr>
@@ -5628,7 +5690,15 @@
           </w:tcPr>
           <w:p>
             <w:r>
-              <w:t>Understanding IaC Practices – Topics 10</w:t>
+              <w:t xml:space="preserve">Understanding </w:t>
+            </w:r>
+            <w:proofErr w:type="spellStart"/>
+            <w:r>
+              <w:t>IaC</w:t>
+            </w:r>
+            <w:proofErr w:type="spellEnd"/>
+            <w:r>
+              <w:t xml:space="preserve"> Practices – Topics 10</w:t>
             </w:r>
           </w:p>
         </w:tc>
@@ -5908,7 +5978,15 @@
           </w:tcPr>
           <w:p>
             <w:r>
-              <w:t xml:space="preserve">Protecting tfstate in a Remote Backend </w:t>
+              <w:t xml:space="preserve">Protecting </w:t>
+            </w:r>
+            <w:proofErr w:type="spellStart"/>
+            <w:r>
+              <w:t>tfstate</w:t>
+            </w:r>
+            <w:proofErr w:type="spellEnd"/>
+            <w:r>
+              <w:t xml:space="preserve"> in a Remote Backend </w:t>
             </w:r>
           </w:p>
         </w:tc>
@@ -6115,8 +6193,13 @@
             <w:shd w:val="clear" w:color="auto" w:fill="E7E6E6" w:themeFill="background2"/>
           </w:tcPr>
           <w:p>
-            <w:r>
-              <w:t>Wrting the First Playbook – Topics 3</w:t>
+            <w:proofErr w:type="spellStart"/>
+            <w:r>
+              <w:t>Wrting</w:t>
+            </w:r>
+            <w:proofErr w:type="spellEnd"/>
+            <w:r>
+              <w:t xml:space="preserve"> the First Playbook – Topics 3</w:t>
             </w:r>
           </w:p>
         </w:tc>
@@ -6713,7 +6796,23 @@
           </w:tcPr>
           <w:p>
             <w:r>
-              <w:t>Understanding the GIt Process and GitFlow Pattern – Topics 4</w:t>
+              <w:t xml:space="preserve">Understanding the </w:t>
+            </w:r>
+            <w:proofErr w:type="spellStart"/>
+            <w:r>
+              <w:t>GIt</w:t>
+            </w:r>
+            <w:proofErr w:type="spellEnd"/>
+            <w:r>
+              <w:t xml:space="preserve"> Process and </w:t>
+            </w:r>
+            <w:proofErr w:type="spellStart"/>
+            <w:r>
+              <w:t>GitFlow</w:t>
+            </w:r>
+            <w:proofErr w:type="spellEnd"/>
+            <w:r>
+              <w:t xml:space="preserve"> Pattern – Topics 4</w:t>
             </w:r>
           </w:p>
         </w:tc>
@@ -6738,7 +6837,23 @@
           </w:tcPr>
           <w:p>
             <w:r>
-              <w:t>Understanding the GIt Process and GitFlow Pattern – Topics 4</w:t>
+              <w:t xml:space="preserve">Understanding the </w:t>
+            </w:r>
+            <w:proofErr w:type="spellStart"/>
+            <w:r>
+              <w:t>GIt</w:t>
+            </w:r>
+            <w:proofErr w:type="spellEnd"/>
+            <w:r>
+              <w:t xml:space="preserve"> Process and </w:t>
+            </w:r>
+            <w:proofErr w:type="spellStart"/>
+            <w:r>
+              <w:t>GitFlow</w:t>
+            </w:r>
+            <w:proofErr w:type="spellEnd"/>
+            <w:r>
+              <w:t xml:space="preserve"> Pattern – Topics 4</w:t>
             </w:r>
           </w:p>
         </w:tc>
@@ -7215,7 +7330,15 @@
           </w:tcPr>
           <w:p>
             <w:r>
-              <w:t xml:space="preserve">Creating a Dockerfile – Topics 2 </w:t>
+              <w:t xml:space="preserve">Creating a </w:t>
+            </w:r>
+            <w:proofErr w:type="spellStart"/>
+            <w:r>
+              <w:t>Dockerfile</w:t>
+            </w:r>
+            <w:proofErr w:type="spellEnd"/>
+            <w:r>
+              <w:t xml:space="preserve"> – Topics 2 </w:t>
             </w:r>
           </w:p>
         </w:tc>
@@ -7334,8 +7457,13 @@
             <w:shd w:val="clear" w:color="auto" w:fill="E7E6E6" w:themeFill="background2"/>
           </w:tcPr>
           <w:p>
-            <w:r>
-              <w:t xml:space="preserve">Questoins </w:t>
+            <w:proofErr w:type="spellStart"/>
+            <w:r>
+              <w:t>Questoins</w:t>
+            </w:r>
+            <w:proofErr w:type="spellEnd"/>
+            <w:r>
+              <w:t xml:space="preserve"> </w:t>
             </w:r>
           </w:p>
         </w:tc>
@@ -8117,8 +8245,13 @@
           </w:tcPr>
           <w:p>
             <w:r>
-              <w:t>Real-time Analysis with SonarLint</w:t>
-            </w:r>
+              <w:t xml:space="preserve">Real-time Analysis with </w:t>
+            </w:r>
+            <w:proofErr w:type="spellStart"/>
+            <w:r>
+              <w:t>SonarLint</w:t>
+            </w:r>
+            <w:proofErr w:type="spellEnd"/>
           </w:p>
         </w:tc>
       </w:tr>
@@ -8141,7 +8274,15 @@
           </w:tcPr>
           <w:p>
             <w:r>
-              <w:t xml:space="preserve">Executing SonarQUbe in Continuous Integration – Topics 2 </w:t>
+              <w:t xml:space="preserve">Executing </w:t>
+            </w:r>
+            <w:proofErr w:type="spellStart"/>
+            <w:r>
+              <w:t>SonarQUbe</w:t>
+            </w:r>
+            <w:proofErr w:type="spellEnd"/>
+            <w:r>
+              <w:t xml:space="preserve"> in Continuous Integration – Topics 2 </w:t>
             </w:r>
           </w:p>
         </w:tc>
@@ -8474,7 +8615,25 @@
                 <w:bCs/>
                 <w:color w:val="C00000"/>
               </w:rPr>
-              <w:t xml:space="preserve">Security in the DevOps Process with DevSecOps </w:t>
+              <w:t xml:space="preserve">Security in the DevOps Process with </w:t>
+            </w:r>
+            <w:proofErr w:type="spellStart"/>
+            <w:r>
+              <w:rPr>
+                <w:b/>
+                <w:bCs/>
+                <w:color w:val="C00000"/>
+              </w:rPr>
+              <w:t>DevSecOps</w:t>
+            </w:r>
+            <w:proofErr w:type="spellEnd"/>
+            <w:r>
+              <w:rPr>
+                <w:b/>
+                <w:bCs/>
+                <w:color w:val="C00000"/>
+              </w:rPr>
+              <w:t xml:space="preserve"> </w:t>
             </w:r>
           </w:p>
         </w:tc>
@@ -8522,7 +8681,15 @@
           </w:tcPr>
           <w:p>
             <w:r>
-              <w:t xml:space="preserve">Testing Azure Infrastructure Compliance with Chef InSpec – 7 </w:t>
+              <w:t xml:space="preserve">Testing Azure Infrastructure Compliance with Chef </w:t>
+            </w:r>
+            <w:proofErr w:type="spellStart"/>
+            <w:r>
+              <w:t>InSpec</w:t>
+            </w:r>
+            <w:proofErr w:type="spellEnd"/>
+            <w:r>
+              <w:t xml:space="preserve"> – 7 </w:t>
             </w:r>
           </w:p>
         </w:tc>
@@ -8570,7 +8737,15 @@
           </w:tcPr>
           <w:p>
             <w:r>
-              <w:t xml:space="preserve">Preserving Data with HashiCorp’s Vault – Topics 6 </w:t>
+              <w:t xml:space="preserve">Preserving Data with </w:t>
+            </w:r>
+            <w:proofErr w:type="spellStart"/>
+            <w:r>
+              <w:t>HashiCorp’s</w:t>
+            </w:r>
+            <w:proofErr w:type="spellEnd"/>
+            <w:r>
+              <w:t xml:space="preserve"> Vault – Topics 6 </w:t>
             </w:r>
           </w:p>
         </w:tc>
@@ -8826,7 +9001,15 @@
           </w:tcPr>
           <w:p>
             <w:r>
-              <w:t xml:space="preserve">Using an Open Source Framework for Feature Flags </w:t>
+              <w:t xml:space="preserve">Using an </w:t>
+            </w:r>
+            <w:proofErr w:type="gramStart"/>
+            <w:r>
+              <w:t>Open Source</w:t>
+            </w:r>
+            <w:proofErr w:type="gramEnd"/>
+            <w:r>
+              <w:t xml:space="preserve"> Framework for Feature Flags </w:t>
             </w:r>
           </w:p>
         </w:tc>
@@ -8850,7 +9033,15 @@
           </w:tcPr>
           <w:p>
             <w:r>
-              <w:t xml:space="preserve">Using the LaunchDarkly Solution </w:t>
+              <w:t xml:space="preserve">Using the </w:t>
+            </w:r>
+            <w:proofErr w:type="spellStart"/>
+            <w:r>
+              <w:t>LaunchDarkly</w:t>
+            </w:r>
+            <w:proofErr w:type="spellEnd"/>
+            <w:r>
+              <w:t xml:space="preserve"> Solution </w:t>
             </w:r>
           </w:p>
         </w:tc>
@@ -8962,7 +9153,25 @@
                 <w:bCs/>
                 <w:color w:val="C00000"/>
               </w:rPr>
-              <w:t xml:space="preserve">DevOps for Open Source Projects </w:t>
+              <w:t xml:space="preserve">DevOps for </w:t>
+            </w:r>
+            <w:proofErr w:type="gramStart"/>
+            <w:r>
+              <w:rPr>
+                <w:b/>
+                <w:bCs/>
+                <w:color w:val="C00000"/>
+              </w:rPr>
+              <w:t>Open Source</w:t>
+            </w:r>
+            <w:proofErr w:type="gramEnd"/>
+            <w:r>
+              <w:rPr>
+                <w:b/>
+                <w:bCs/>
+                <w:color w:val="C00000"/>
+              </w:rPr>
+              <w:t xml:space="preserve"> Projects </w:t>
             </w:r>
           </w:p>
         </w:tc>
@@ -9154,7 +9363,15 @@
           </w:tcPr>
           <w:p>
             <w:r>
-              <w:t xml:space="preserve">Analyzing Code with SonarCloud </w:t>
+              <w:t xml:space="preserve">Analyzing Code with </w:t>
+            </w:r>
+            <w:proofErr w:type="spellStart"/>
+            <w:r>
+              <w:t>SonarCloud</w:t>
+            </w:r>
+            <w:proofErr w:type="spellEnd"/>
+            <w:r>
+              <w:t xml:space="preserve"> </w:t>
             </w:r>
           </w:p>
         </w:tc>
@@ -9178,7 +9395,15 @@
           </w:tcPr>
           <w:p>
             <w:r>
-              <w:t xml:space="preserve">Detecting Security Vulnerabilities with WhiteSOurce Bold </w:t>
+              <w:t xml:space="preserve">Detecting Security Vulnerabilities with </w:t>
+            </w:r>
+            <w:proofErr w:type="spellStart"/>
+            <w:r>
+              <w:t>WhiteSOurce</w:t>
+            </w:r>
+            <w:proofErr w:type="spellEnd"/>
+            <w:r>
+              <w:t xml:space="preserve"> Bold </w:t>
             </w:r>
           </w:p>
         </w:tc>
@@ -9459,7 +9684,15 @@
           </w:tcPr>
           <w:p>
             <w:r>
-              <w:t xml:space="preserve">Applying Security with DevSecOps </w:t>
+              <w:t xml:space="preserve">Applying Security with </w:t>
+            </w:r>
+            <w:proofErr w:type="spellStart"/>
+            <w:r>
+              <w:t>DevSecOps</w:t>
+            </w:r>
+            <w:proofErr w:type="spellEnd"/>
+            <w:r>
+              <w:t xml:space="preserve"> </w:t>
             </w:r>
           </w:p>
         </w:tc>
@@ -11202,7 +11435,15 @@
           </w:tcPr>
           <w:p>
             <w:r>
-              <w:t xml:space="preserve">Use Case: Open Source Infrastructure with Puppet – Topics 2 </w:t>
+              <w:t xml:space="preserve">Use Case: </w:t>
+            </w:r>
+            <w:proofErr w:type="gramStart"/>
+            <w:r>
+              <w:t>Open Source</w:t>
+            </w:r>
+            <w:proofErr w:type="gramEnd"/>
+            <w:r>
+              <w:t xml:space="preserve"> Infrastructure with Puppet – Topics 2 </w:t>
             </w:r>
           </w:p>
         </w:tc>
@@ -11848,8 +12089,13 @@
           </w:tcPr>
           <w:p>
             <w:r>
-              <w:t>Linux CLI (Ubuntu/CentOS), Bash, SSH, Permissions, Systemd</w:t>
-            </w:r>
+              <w:t xml:space="preserve">Linux CLI (Ubuntu/CentOS), Bash, SSH, Permissions, </w:t>
+            </w:r>
+            <w:proofErr w:type="spellStart"/>
+            <w:r>
+              <w:t>Systemd</w:t>
+            </w:r>
+            <w:proofErr w:type="spellEnd"/>
           </w:p>
         </w:tc>
         <w:tc>
@@ -12276,7 +12522,15 @@
               <w:t>C++:</w:t>
             </w:r>
             <w:r>
-              <w:t xml:space="preserve"> CMake, Conan</w:t>
+              <w:t xml:space="preserve"> </w:t>
+            </w:r>
+            <w:proofErr w:type="spellStart"/>
+            <w:r>
+              <w:t>CMake</w:t>
+            </w:r>
+            <w:proofErr w:type="spellEnd"/>
+            <w:r>
+              <w:t>, Conan</w:t>
             </w:r>
             <w:r>
               <w:br/>
@@ -12302,8 +12556,13 @@
               <w:t>JavaScript:</w:t>
             </w:r>
             <w:r>
-              <w:t xml:space="preserve"> Vite, npm</w:t>
-            </w:r>
+              <w:t xml:space="preserve"> Vite, </w:t>
+            </w:r>
+            <w:proofErr w:type="spellStart"/>
+            <w:r>
+              <w:t>npm</w:t>
+            </w:r>
+            <w:proofErr w:type="spellEnd"/>
           </w:p>
         </w:tc>
         <w:tc>
@@ -12418,8 +12677,13 @@
               <w:t>Python:</w:t>
             </w:r>
             <w:r>
-              <w:t xml:space="preserve"> pytest</w:t>
-            </w:r>
+              <w:t xml:space="preserve"> </w:t>
+            </w:r>
+            <w:proofErr w:type="spellStart"/>
+            <w:r>
+              <w:t>pytest</w:t>
+            </w:r>
+            <w:proofErr w:type="spellEnd"/>
             <w:r>
               <w:br/>
             </w:r>
@@ -12617,7 +12881,15 @@
           </w:tcPr>
           <w:p>
             <w:r>
-              <w:t>GitHub Actions, GitLab CI, ArgoCD, Spinnaker</w:t>
+              <w:t xml:space="preserve">GitHub Actions, GitLab CI, </w:t>
+            </w:r>
+            <w:proofErr w:type="spellStart"/>
+            <w:r>
+              <w:t>ArgoCD</w:t>
+            </w:r>
+            <w:proofErr w:type="spellEnd"/>
+            <w:r>
+              <w:t>, Spinnaker</w:t>
             </w:r>
           </w:p>
         </w:tc>
@@ -12946,8 +13218,21 @@
           </w:tcPr>
           <w:p>
             <w:r>
-              <w:t>Kubernetes (K8s), Minikube, kubectl</w:t>
-            </w:r>
+              <w:t xml:space="preserve">Kubernetes (K8s), </w:t>
+            </w:r>
+            <w:proofErr w:type="spellStart"/>
+            <w:r>
+              <w:t>Minikube</w:t>
+            </w:r>
+            <w:proofErr w:type="spellEnd"/>
+            <w:r>
+              <w:t xml:space="preserve">, </w:t>
+            </w:r>
+            <w:proofErr w:type="spellStart"/>
+            <w:r>
+              <w:t>kubectl</w:t>
+            </w:r>
+            <w:proofErr w:type="spellEnd"/>
           </w:p>
         </w:tc>
         <w:tc>
@@ -13036,8 +13321,13 @@
           </w:tcPr>
           <w:p>
             <w:r>
-              <w:t>Helm, Ingress, Persistent Volumes, ConfigMaps</w:t>
-            </w:r>
+              <w:t xml:space="preserve">Helm, Ingress, Persistent Volumes, </w:t>
+            </w:r>
+            <w:proofErr w:type="spellStart"/>
+            <w:r>
+              <w:t>ConfigMaps</w:t>
+            </w:r>
+            <w:proofErr w:type="spellEnd"/>
           </w:p>
         </w:tc>
         <w:tc>
@@ -13442,7 +13732,23 @@
                 <w:b/>
                 <w:bCs/>
               </w:rPr>
-              <w:t>Infrastructure as Code (IaC)</w:t>
+              <w:t>Infrastructure as Code (</w:t>
+            </w:r>
+            <w:proofErr w:type="spellStart"/>
+            <w:r>
+              <w:rPr>
+                <w:b/>
+                <w:bCs/>
+              </w:rPr>
+              <w:t>IaC</w:t>
+            </w:r>
+            <w:proofErr w:type="spellEnd"/>
+            <w:r>
+              <w:rPr>
+                <w:b/>
+                <w:bCs/>
+              </w:rPr>
+              <w:t>)</w:t>
             </w:r>
           </w:p>
         </w:tc>
@@ -13617,6 +13923,7 @@
                 <w:bCs/>
               </w:rPr>
             </w:pPr>
+            <w:proofErr w:type="spellStart"/>
             <w:r>
               <w:rPr>
                 <w:b/>
@@ -13624,6 +13931,7 @@
               </w:rPr>
               <w:t>GitOps</w:t>
             </w:r>
+            <w:proofErr w:type="spellEnd"/>
           </w:p>
         </w:tc>
         <w:tc>
@@ -13633,8 +13941,13 @@
             <w:vAlign w:val="center"/>
           </w:tcPr>
           <w:p>
-            <w:r>
-              <w:t>ArgoCD, Flux</w:t>
+            <w:proofErr w:type="spellStart"/>
+            <w:r>
+              <w:t>ArgoCD</w:t>
+            </w:r>
+            <w:proofErr w:type="spellEnd"/>
+            <w:r>
+              <w:t>, Flux</w:t>
             </w:r>
           </w:p>
         </w:tc>
@@ -13646,7 +13959,15 @@
           </w:tcPr>
           <w:p>
             <w:r>
-              <w:t>Implement GitOps: use Git as the single source of truth for your infrastructure and application state.</w:t>
+              <w:t xml:space="preserve">Implement </w:t>
+            </w:r>
+            <w:proofErr w:type="spellStart"/>
+            <w:r>
+              <w:t>GitOps</w:t>
+            </w:r>
+            <w:proofErr w:type="spellEnd"/>
+            <w:r>
+              <w:t>: use Git as the single source of truth for your infrastructure and application state.</w:t>
             </w:r>
           </w:p>
         </w:tc>
@@ -14051,9 +14372,19 @@
             <w:vAlign w:val="center"/>
           </w:tcPr>
           <w:p>
-            <w:r>
-              <w:t>Alertmanager, PagerDuty, Opsgenie</w:t>
-            </w:r>
+            <w:proofErr w:type="spellStart"/>
+            <w:r>
+              <w:t>Alertmanager</w:t>
+            </w:r>
+            <w:proofErr w:type="spellEnd"/>
+            <w:r>
+              <w:t xml:space="preserve">, PagerDuty, </w:t>
+            </w:r>
+            <w:proofErr w:type="spellStart"/>
+            <w:r>
+              <w:t>Opsgenie</w:t>
+            </w:r>
+            <w:proofErr w:type="spellEnd"/>
           </w:p>
         </w:tc>
         <w:tc>
@@ -14142,7 +14473,15 @@
           </w:tcPr>
           <w:p>
             <w:r>
-              <w:t>Jaeger, Zipkin, Sentry, GDB/Valgrind (C++)</w:t>
+              <w:t>Jaeger, Zipkin, Sentry, GDB/</w:t>
+            </w:r>
+            <w:proofErr w:type="spellStart"/>
+            <w:r>
+              <w:t>Valgrind</w:t>
+            </w:r>
+            <w:proofErr w:type="spellEnd"/>
+            <w:r>
+              <w:t xml:space="preserve"> (C++)</w:t>
             </w:r>
           </w:p>
         </w:tc>
@@ -14373,7 +14712,23 @@
                 <w:b/>
                 <w:bCs/>
               </w:rPr>
-              <w:t>Security (DevSecOps)</w:t>
+              <w:t>Security (</w:t>
+            </w:r>
+            <w:proofErr w:type="spellStart"/>
+            <w:r>
+              <w:rPr>
+                <w:b/>
+                <w:bCs/>
+              </w:rPr>
+              <w:t>DevSecOps</w:t>
+            </w:r>
+            <w:proofErr w:type="spellEnd"/>
+            <w:r>
+              <w:rPr>
+                <w:b/>
+                <w:bCs/>
+              </w:rPr>
+              <w:t>)</w:t>
             </w:r>
           </w:p>
         </w:tc>
@@ -14385,7 +14740,23 @@
           </w:tcPr>
           <w:p>
             <w:r>
-              <w:t>SonarQube, Snyk, Trivy, OWASP ZAP</w:t>
+              <w:t xml:space="preserve">SonarQube, </w:t>
+            </w:r>
+            <w:proofErr w:type="spellStart"/>
+            <w:r>
+              <w:t>Snyk</w:t>
+            </w:r>
+            <w:proofErr w:type="spellEnd"/>
+            <w:r>
+              <w:t xml:space="preserve">, </w:t>
+            </w:r>
+            <w:proofErr w:type="spellStart"/>
+            <w:r>
+              <w:t>Trivy</w:t>
+            </w:r>
+            <w:proofErr w:type="spellEnd"/>
+            <w:r>
+              <w:t>, OWASP ZAP</w:t>
             </w:r>
           </w:p>
         </w:tc>
@@ -14463,7 +14834,23 @@
                 <w:b/>
                 <w:bCs/>
               </w:rPr>
-              <w:t>AI &amp; MLOps (Optional)</w:t>
+              <w:t xml:space="preserve">AI &amp; </w:t>
+            </w:r>
+            <w:proofErr w:type="spellStart"/>
+            <w:r>
+              <w:rPr>
+                <w:b/>
+                <w:bCs/>
+              </w:rPr>
+              <w:t>MLOps</w:t>
+            </w:r>
+            <w:proofErr w:type="spellEnd"/>
+            <w:r>
+              <w:rPr>
+                <w:b/>
+                <w:bCs/>
+              </w:rPr>
+              <w:t xml:space="preserve"> (Optional)</w:t>
             </w:r>
           </w:p>
         </w:tc>
@@ -14474,8 +14861,13 @@
             <w:vAlign w:val="center"/>
           </w:tcPr>
           <w:p>
-            <w:r>
-              <w:t>MLflow, Kubeflow, NVIDIA Triton, DVC</w:t>
+            <w:proofErr w:type="spellStart"/>
+            <w:r>
+              <w:t>MLflow</w:t>
+            </w:r>
+            <w:proofErr w:type="spellEnd"/>
+            <w:r>
+              <w:t>, Kubeflow, NVIDIA Triton, DVC</w:t>
             </w:r>
           </w:p>
         </w:tc>
@@ -15201,10 +15593,27 @@
           <w:b/>
           <w:bCs/>
         </w:rPr>
-        <w:t>Join a Community</w:t>
+        <w:t xml:space="preserve">Join a </w:t>
       </w:r>
+      <w:proofErr w:type="gramStart"/>
       <w:r>
-        <w:t>: Engage with DevOps communities on Reddit (r/devops), LinkedIn, or Discord. Ask questions and learn from others.</w:t>
+        <w:rPr>
+          <w:b/>
+          <w:bCs/>
+        </w:rPr>
+        <w:t>Community</w:t>
+      </w:r>
+      <w:proofErr w:type="gramEnd"/>
+      <w:r>
+        <w:t>: Engage with DevOps communities on Reddit (r/</w:t>
+      </w:r>
+      <w:proofErr w:type="spellStart"/>
+      <w:r>
+        <w:t>devops</w:t>
+      </w:r>
+      <w:proofErr w:type="spellEnd"/>
+      <w:r>
+        <w:t>), LinkedIn, or Discord. Ask questions and learn from others.</w:t>
       </w:r>
     </w:p>
     <w:p/>
@@ -15355,7 +15764,7 @@
     <w:p>
       <w:r>
         <w:pict w14:anchorId="39872229">
-          <v:rect id="_x0000_i1029" style="width:0;height:1.5pt" o:hralign="center" o:hrstd="t" o:hr="t" fillcolor="#a0a0a0" stroked="f"/>
+          <v:rect id="_x0000_i1025" style="width:0;height:1.5pt" o:hralign="center" o:hrstd="t" o:hr="t" fillcolor="#a0a0a0" stroked="f"/>
         </w:pict>
       </w:r>
     </w:p>
@@ -16006,8 +16415,13 @@
           </w:tcPr>
           <w:p>
             <w:r>
-              <w:t>GitHub Copilot, SourceCraft</w:t>
-            </w:r>
+              <w:t xml:space="preserve">GitHub Copilot, </w:t>
+            </w:r>
+            <w:proofErr w:type="spellStart"/>
+            <w:r>
+              <w:t>SourceCraft</w:t>
+            </w:r>
+            <w:proofErr w:type="spellEnd"/>
           </w:p>
         </w:tc>
         <w:tc>
@@ -16042,7 +16456,15 @@
           </w:tcPr>
           <w:p>
             <w:r>
-              <w:t>GitHub Copilot, Cursor AI, Sourcegraph Cody</w:t>
+              <w:t xml:space="preserve">GitHub Copilot, Cursor AI, </w:t>
+            </w:r>
+            <w:proofErr w:type="spellStart"/>
+            <w:r>
+              <w:t>Sourcegraph</w:t>
+            </w:r>
+            <w:proofErr w:type="spellEnd"/>
+            <w:r>
+              <w:t xml:space="preserve"> Cody</w:t>
             </w:r>
           </w:p>
         </w:tc>
@@ -16100,7 +16522,15 @@
           </w:tcPr>
           <w:p>
             <w:r>
-              <w:t>Conan, vcpkg, Build2</w:t>
+              <w:t xml:space="preserve">Conan, </w:t>
+            </w:r>
+            <w:proofErr w:type="spellStart"/>
+            <w:r>
+              <w:t>vcpkg</w:t>
+            </w:r>
+            <w:proofErr w:type="spellEnd"/>
+            <w:r>
+              <w:t>, Build2</w:t>
             </w:r>
           </w:p>
         </w:tc>
@@ -16123,9 +16553,19 @@
             <w:vAlign w:val="center"/>
           </w:tcPr>
           <w:p>
-            <w:r>
-              <w:t>npm, yarn, pnpm</w:t>
-            </w:r>
+            <w:proofErr w:type="spellStart"/>
+            <w:r>
+              <w:t>npm</w:t>
+            </w:r>
+            <w:proofErr w:type="spellEnd"/>
+            <w:r>
+              <w:t xml:space="preserve">, yarn, </w:t>
+            </w:r>
+            <w:proofErr w:type="spellStart"/>
+            <w:r>
+              <w:t>pnpm</w:t>
+            </w:r>
+            <w:proofErr w:type="spellEnd"/>
           </w:p>
         </w:tc>
         <w:tc>
@@ -16193,8 +16633,13 @@
             <w:vAlign w:val="center"/>
           </w:tcPr>
           <w:p>
-            <w:r>
-              <w:t>CMake, Ninja, Bazel, Make</w:t>
+            <w:proofErr w:type="spellStart"/>
+            <w:r>
+              <w:t>CMake</w:t>
+            </w:r>
+            <w:proofErr w:type="spellEnd"/>
+            <w:r>
+              <w:t>, Ninja, Bazel, Make</w:t>
             </w:r>
           </w:p>
         </w:tc>
@@ -16205,9 +16650,19 @@
             <w:vAlign w:val="center"/>
           </w:tcPr>
           <w:p>
-            <w:r>
-              <w:t>Setuptools, Poetry, PyInstaller</w:t>
-            </w:r>
+            <w:proofErr w:type="spellStart"/>
+            <w:r>
+              <w:t>Setuptools</w:t>
+            </w:r>
+            <w:proofErr w:type="spellEnd"/>
+            <w:r>
+              <w:t xml:space="preserve">, Poetry, </w:t>
+            </w:r>
+            <w:proofErr w:type="spellStart"/>
+            <w:r>
+              <w:t>PyInstaller</w:t>
+            </w:r>
+            <w:proofErr w:type="spellEnd"/>
           </w:p>
         </w:tc>
         <w:tc>
@@ -16218,7 +16673,15 @@
           </w:tcPr>
           <w:p>
             <w:r>
-              <w:t>Vite, Webpack, esbuild, Rollup</w:t>
+              <w:t xml:space="preserve">Vite, Webpack, </w:t>
+            </w:r>
+            <w:proofErr w:type="spellStart"/>
+            <w:r>
+              <w:t>esbuild</w:t>
+            </w:r>
+            <w:proofErr w:type="spellEnd"/>
+            <w:r>
+              <w:t>, Rollup</w:t>
             </w:r>
           </w:p>
         </w:tc>
@@ -16229,8 +16692,13 @@
             <w:vAlign w:val="center"/>
           </w:tcPr>
           <w:p>
-            <w:r>
-              <w:t>Setuptools, Poetry, Bazel</w:t>
+            <w:proofErr w:type="spellStart"/>
+            <w:r>
+              <w:t>Setuptools</w:t>
+            </w:r>
+            <w:proofErr w:type="spellEnd"/>
+            <w:r>
+              <w:t>, Poetry, Bazel</w:t>
             </w:r>
           </w:p>
         </w:tc>
@@ -16300,8 +16768,13 @@
           </w:tcPr>
           <w:p>
             <w:r>
-              <w:t>Ruff, Flake8, Black, mypy</w:t>
-            </w:r>
+              <w:t xml:space="preserve">Ruff, Flake8, Black, </w:t>
+            </w:r>
+            <w:proofErr w:type="spellStart"/>
+            <w:r>
+              <w:t>mypy</w:t>
+            </w:r>
+            <w:proofErr w:type="spellEnd"/>
           </w:p>
         </w:tc>
         <w:tc>
@@ -16311,8 +16784,13 @@
             <w:vAlign w:val="center"/>
           </w:tcPr>
           <w:p>
-            <w:r>
-              <w:t>ESLint, Prettier, SonarQube</w:t>
+            <w:proofErr w:type="spellStart"/>
+            <w:r>
+              <w:t>ESLint</w:t>
+            </w:r>
+            <w:proofErr w:type="spellEnd"/>
+            <w:r>
+              <w:t>, Prettier, SonarQube</w:t>
             </w:r>
           </w:p>
         </w:tc>
@@ -16324,8 +16802,21 @@
           </w:tcPr>
           <w:p>
             <w:r>
-              <w:t>Ruff, Pylint, mypy</w:t>
-            </w:r>
+              <w:t xml:space="preserve">Ruff, </w:t>
+            </w:r>
+            <w:proofErr w:type="spellStart"/>
+            <w:r>
+              <w:t>Pylint</w:t>
+            </w:r>
+            <w:proofErr w:type="spellEnd"/>
+            <w:r>
+              <w:t xml:space="preserve">, </w:t>
+            </w:r>
+            <w:proofErr w:type="spellStart"/>
+            <w:r>
+              <w:t>mypy</w:t>
+            </w:r>
+            <w:proofErr w:type="spellEnd"/>
           </w:p>
         </w:tc>
       </w:tr>
@@ -16382,8 +16873,13 @@
           </w:tcPr>
           <w:p>
             <w:r>
-              <w:t>Google Test, Catch2, CTest</w:t>
-            </w:r>
+              <w:t xml:space="preserve">Google Test, Catch2, </w:t>
+            </w:r>
+            <w:proofErr w:type="spellStart"/>
+            <w:r>
+              <w:t>CTest</w:t>
+            </w:r>
+            <w:proofErr w:type="spellEnd"/>
           </w:p>
         </w:tc>
         <w:tc>
@@ -16393,8 +16889,21 @@
             <w:vAlign w:val="center"/>
           </w:tcPr>
           <w:p>
-            <w:r>
-              <w:t>pytest, unittest, nose</w:t>
+            <w:proofErr w:type="spellStart"/>
+            <w:r>
+              <w:t>pytest</w:t>
+            </w:r>
+            <w:proofErr w:type="spellEnd"/>
+            <w:r>
+              <w:t xml:space="preserve">, </w:t>
+            </w:r>
+            <w:proofErr w:type="spellStart"/>
+            <w:r>
+              <w:t>unittest</w:t>
+            </w:r>
+            <w:proofErr w:type="spellEnd"/>
+            <w:r>
+              <w:t>, nose</w:t>
             </w:r>
           </w:p>
         </w:tc>
@@ -16406,7 +16915,15 @@
           </w:tcPr>
           <w:p>
             <w:r>
-              <w:t>Jest, Vitest, Mocha</w:t>
+              <w:t xml:space="preserve">Jest, </w:t>
+            </w:r>
+            <w:proofErr w:type="spellStart"/>
+            <w:r>
+              <w:t>Vitest</w:t>
+            </w:r>
+            <w:proofErr w:type="spellEnd"/>
+            <w:r>
+              <w:t>, Mocha</w:t>
             </w:r>
           </w:p>
         </w:tc>
@@ -16417,9 +16934,19 @@
             <w:vAlign w:val="center"/>
           </w:tcPr>
           <w:p>
-            <w:r>
-              <w:t>pytest, unittest</w:t>
-            </w:r>
+            <w:proofErr w:type="spellStart"/>
+            <w:r>
+              <w:t>pytest</w:t>
+            </w:r>
+            <w:proofErr w:type="spellEnd"/>
+            <w:r>
+              <w:t xml:space="preserve">, </w:t>
+            </w:r>
+            <w:proofErr w:type="spellStart"/>
+            <w:r>
+              <w:t>unittest</w:t>
+            </w:r>
+            <w:proofErr w:type="spellEnd"/>
           </w:p>
         </w:tc>
       </w:tr>
@@ -16570,8 +17097,13 @@
           </w:tcPr>
           <w:p>
             <w:r>
-              <w:t>JMeter, Gatling, Valgrind</w:t>
-            </w:r>
+              <w:t xml:space="preserve">JMeter, Gatling, </w:t>
+            </w:r>
+            <w:proofErr w:type="spellStart"/>
+            <w:r>
+              <w:t>Valgrind</w:t>
+            </w:r>
+            <w:proofErr w:type="spellEnd"/>
           </w:p>
         </w:tc>
         <w:tc>
@@ -16664,8 +17196,13 @@
           </w:tcPr>
           <w:p>
             <w:r>
-              <w:t>SonarQube, CodeQL</w:t>
-            </w:r>
+              <w:t xml:space="preserve">SonarQube, </w:t>
+            </w:r>
+            <w:proofErr w:type="spellStart"/>
+            <w:r>
+              <w:t>CodeQL</w:t>
+            </w:r>
+            <w:proofErr w:type="spellEnd"/>
           </w:p>
         </w:tc>
         <w:tc>
@@ -16676,8 +17213,13 @@
           </w:tcPr>
           <w:p>
             <w:r>
-              <w:t>Bandit, SonarQube, CodeQL</w:t>
-            </w:r>
+              <w:t xml:space="preserve">Bandit, SonarQube, </w:t>
+            </w:r>
+            <w:proofErr w:type="spellStart"/>
+            <w:r>
+              <w:t>CodeQL</w:t>
+            </w:r>
+            <w:proofErr w:type="spellEnd"/>
           </w:p>
         </w:tc>
         <w:tc>
@@ -16688,8 +17230,21 @@
           </w:tcPr>
           <w:p>
             <w:r>
-              <w:t>SonarQube, CodeQL, Snyk</w:t>
-            </w:r>
+              <w:t xml:space="preserve">SonarQube, </w:t>
+            </w:r>
+            <w:proofErr w:type="spellStart"/>
+            <w:r>
+              <w:t>CodeQL</w:t>
+            </w:r>
+            <w:proofErr w:type="spellEnd"/>
+            <w:r>
+              <w:t xml:space="preserve">, </w:t>
+            </w:r>
+            <w:proofErr w:type="spellStart"/>
+            <w:r>
+              <w:t>Snyk</w:t>
+            </w:r>
+            <w:proofErr w:type="spellEnd"/>
           </w:p>
         </w:tc>
         <w:tc>
@@ -16700,8 +17255,13 @@
           </w:tcPr>
           <w:p>
             <w:r>
-              <w:t>Bandit, SonarQube, CodeQL</w:t>
-            </w:r>
+              <w:t xml:space="preserve">Bandit, SonarQube, </w:t>
+            </w:r>
+            <w:proofErr w:type="spellStart"/>
+            <w:r>
+              <w:t>CodeQL</w:t>
+            </w:r>
+            <w:proofErr w:type="spellEnd"/>
           </w:p>
         </w:tc>
       </w:tr>
@@ -16782,8 +17342,13 @@
           </w:tcPr>
           <w:p>
             <w:r>
-              <w:t>GitHub Actions, GitLab CI, CircleCI</w:t>
-            </w:r>
+              <w:t xml:space="preserve">GitHub Actions, GitLab CI, </w:t>
+            </w:r>
+            <w:proofErr w:type="spellStart"/>
+            <w:r>
+              <w:t>CircleCI</w:t>
+            </w:r>
+            <w:proofErr w:type="spellEnd"/>
           </w:p>
         </w:tc>
         <w:tc>
@@ -16840,8 +17405,17 @@
                 <w:b/>
                 <w:bCs/>
               </w:rPr>
-              <w:t>Continuous Delivery / GitOps</w:t>
-            </w:r>
+              <w:t xml:space="preserve">Continuous Delivery / </w:t>
+            </w:r>
+            <w:proofErr w:type="spellStart"/>
+            <w:r>
+              <w:rPr>
+                <w:b/>
+                <w:bCs/>
+              </w:rPr>
+              <w:t>GitOps</w:t>
+            </w:r>
+            <w:proofErr w:type="spellEnd"/>
           </w:p>
         </w:tc>
         <w:tc>
@@ -16851,8 +17425,13 @@
             <w:vAlign w:val="center"/>
           </w:tcPr>
           <w:p>
-            <w:r>
-              <w:t>ArgoCD, Flux</w:t>
+            <w:proofErr w:type="spellStart"/>
+            <w:r>
+              <w:t>ArgoCD</w:t>
+            </w:r>
+            <w:proofErr w:type="spellEnd"/>
+            <w:r>
+              <w:t>, Flux</w:t>
             </w:r>
           </w:p>
         </w:tc>
@@ -16863,8 +17442,13 @@
             <w:vAlign w:val="center"/>
           </w:tcPr>
           <w:p>
-            <w:r>
-              <w:t>ArgoCD, Flux, Spinnaker</w:t>
+            <w:proofErr w:type="spellStart"/>
+            <w:r>
+              <w:t>ArgoCD</w:t>
+            </w:r>
+            <w:proofErr w:type="spellEnd"/>
+            <w:r>
+              <w:t>, Flux, Spinnaker</w:t>
             </w:r>
           </w:p>
         </w:tc>
@@ -16875,8 +17459,21 @@
             <w:vAlign w:val="center"/>
           </w:tcPr>
           <w:p>
-            <w:r>
-              <w:t>ArgoCD, Flux, Vercel, Netlify</w:t>
+            <w:proofErr w:type="spellStart"/>
+            <w:r>
+              <w:t>ArgoCD</w:t>
+            </w:r>
+            <w:proofErr w:type="spellEnd"/>
+            <w:r>
+              <w:t xml:space="preserve">, Flux, </w:t>
+            </w:r>
+            <w:proofErr w:type="spellStart"/>
+            <w:r>
+              <w:t>Vercel</w:t>
+            </w:r>
+            <w:proofErr w:type="spellEnd"/>
+            <w:r>
+              <w:t>, Netlify</w:t>
             </w:r>
           </w:p>
         </w:tc>
@@ -16887,8 +17484,13 @@
             <w:vAlign w:val="center"/>
           </w:tcPr>
           <w:p>
-            <w:r>
-              <w:t>ArgoCD, Flux, Kubeflow</w:t>
+            <w:proofErr w:type="spellStart"/>
+            <w:r>
+              <w:t>ArgoCD</w:t>
+            </w:r>
+            <w:proofErr w:type="spellEnd"/>
+            <w:r>
+              <w:t>, Flux, Kubeflow</w:t>
             </w:r>
           </w:p>
         </w:tc>
@@ -16946,8 +17548,13 @@
           </w:tcPr>
           <w:p>
             <w:r>
-              <w:t>Docker, Podman</w:t>
-            </w:r>
+              <w:t xml:space="preserve">Docker, </w:t>
+            </w:r>
+            <w:proofErr w:type="spellStart"/>
+            <w:r>
+              <w:t>Podman</w:t>
+            </w:r>
+            <w:proofErr w:type="spellEnd"/>
           </w:p>
         </w:tc>
         <w:tc>
@@ -16958,8 +17565,13 @@
           </w:tcPr>
           <w:p>
             <w:r>
-              <w:t>Docker, Podman</w:t>
-            </w:r>
+              <w:t xml:space="preserve">Docker, </w:t>
+            </w:r>
+            <w:proofErr w:type="spellStart"/>
+            <w:r>
+              <w:t>Podman</w:t>
+            </w:r>
+            <w:proofErr w:type="spellEnd"/>
           </w:p>
         </w:tc>
         <w:tc>
@@ -16970,8 +17582,13 @@
           </w:tcPr>
           <w:p>
             <w:r>
-              <w:t>Docker, Podman</w:t>
-            </w:r>
+              <w:t xml:space="preserve">Docker, </w:t>
+            </w:r>
+            <w:proofErr w:type="spellStart"/>
+            <w:r>
+              <w:t>Podman</w:t>
+            </w:r>
+            <w:proofErr w:type="spellEnd"/>
           </w:p>
         </w:tc>
         <w:tc>
@@ -16982,7 +17599,15 @@
           </w:tcPr>
           <w:p>
             <w:r>
-              <w:t>Docker, Podman, NVIDIA Container Toolkit</w:t>
+              <w:t xml:space="preserve">Docker, </w:t>
+            </w:r>
+            <w:proofErr w:type="spellStart"/>
+            <w:r>
+              <w:t>Podman</w:t>
+            </w:r>
+            <w:proofErr w:type="spellEnd"/>
+            <w:r>
+              <w:t>, NVIDIA Container Toolkit</w:t>
             </w:r>
           </w:p>
         </w:tc>
@@ -17123,7 +17748,23 @@
                 <w:b/>
                 <w:bCs/>
               </w:rPr>
-              <w:t>Infrastructure as Code (IaC)</w:t>
+              <w:t>Infrastructure as Code (</w:t>
+            </w:r>
+            <w:proofErr w:type="spellStart"/>
+            <w:r>
+              <w:rPr>
+                <w:b/>
+                <w:bCs/>
+              </w:rPr>
+              <w:t>IaC</w:t>
+            </w:r>
+            <w:proofErr w:type="spellEnd"/>
+            <w:r>
+              <w:rPr>
+                <w:b/>
+                <w:bCs/>
+              </w:rPr>
+              <w:t>)</w:t>
             </w:r>
           </w:p>
         </w:tc>
@@ -17241,7 +17882,15 @@
           </w:tcPr>
           <w:p>
             <w:r>
-              <w:t>Ansible, SaltStack, Fabric</w:t>
+              <w:t xml:space="preserve">Ansible, </w:t>
+            </w:r>
+            <w:proofErr w:type="spellStart"/>
+            <w:r>
+              <w:t>SaltStack</w:t>
+            </w:r>
+            <w:proofErr w:type="spellEnd"/>
+            <w:r>
+              <w:t>, Fabric</w:t>
             </w:r>
           </w:p>
         </w:tc>
@@ -17363,8 +18012,17 @@
                 <w:b/>
                 <w:bCs/>
               </w:rPr>
-              <w:t>NVIDIA Triton, TensorFlow Serving, BentoML</w:t>
-            </w:r>
+              <w:t xml:space="preserve">NVIDIA Triton, TensorFlow Serving, </w:t>
+            </w:r>
+            <w:proofErr w:type="spellStart"/>
+            <w:r>
+              <w:rPr>
+                <w:b/>
+                <w:bCs/>
+              </w:rPr>
+              <w:t>BentoML</w:t>
+            </w:r>
+            <w:proofErr w:type="spellEnd"/>
           </w:p>
         </w:tc>
       </w:tr>
@@ -17467,8 +18125,33 @@
                 <w:b/>
                 <w:bCs/>
               </w:rPr>
-              <w:t>Apache Airflow, Kubeflow, MLflow, Metaflow</w:t>
-            </w:r>
+              <w:t xml:space="preserve">Apache Airflow, Kubeflow, </w:t>
+            </w:r>
+            <w:proofErr w:type="spellStart"/>
+            <w:r>
+              <w:rPr>
+                <w:b/>
+                <w:bCs/>
+              </w:rPr>
+              <w:t>MLflow</w:t>
+            </w:r>
+            <w:proofErr w:type="spellEnd"/>
+            <w:r>
+              <w:rPr>
+                <w:b/>
+                <w:bCs/>
+              </w:rPr>
+              <w:t xml:space="preserve">, </w:t>
+            </w:r>
+            <w:proofErr w:type="spellStart"/>
+            <w:r>
+              <w:rPr>
+                <w:b/>
+                <w:bCs/>
+              </w:rPr>
+              <w:t>Metaflow</w:t>
+            </w:r>
+            <w:proofErr w:type="spellEnd"/>
           </w:p>
         </w:tc>
       </w:tr>
@@ -17525,8 +18208,21 @@
           </w:tcPr>
           <w:p>
             <w:r>
-              <w:t>GDB, Valgrind, AddressSanitizer</w:t>
-            </w:r>
+              <w:t xml:space="preserve">GDB, </w:t>
+            </w:r>
+            <w:proofErr w:type="spellStart"/>
+            <w:r>
+              <w:t>Valgrind</w:t>
+            </w:r>
+            <w:proofErr w:type="spellEnd"/>
+            <w:r>
+              <w:t xml:space="preserve">, </w:t>
+            </w:r>
+            <w:proofErr w:type="spellStart"/>
+            <w:r>
+              <w:t>AddressSanitizer</w:t>
+            </w:r>
+            <w:proofErr w:type="spellEnd"/>
           </w:p>
         </w:tc>
         <w:tc>
@@ -17536,8 +18232,21 @@
             <w:vAlign w:val="center"/>
           </w:tcPr>
           <w:p>
-            <w:r>
-              <w:t>pdb, py-spy, Sentry</w:t>
+            <w:proofErr w:type="spellStart"/>
+            <w:r>
+              <w:t>pdb</w:t>
+            </w:r>
+            <w:proofErr w:type="spellEnd"/>
+            <w:r>
+              <w:t xml:space="preserve">, </w:t>
+            </w:r>
+            <w:proofErr w:type="spellStart"/>
+            <w:r>
+              <w:t>py</w:t>
+            </w:r>
+            <w:proofErr w:type="spellEnd"/>
+            <w:r>
+              <w:t>-spy, Sentry</w:t>
             </w:r>
           </w:p>
         </w:tc>
@@ -17549,7 +18258,15 @@
           </w:tcPr>
           <w:p>
             <w:r>
-              <w:t>Chrome DevTools, Sentry</w:t>
+              <w:t xml:space="preserve">Chrome </w:t>
+            </w:r>
+            <w:proofErr w:type="spellStart"/>
+            <w:r>
+              <w:t>DevTools</w:t>
+            </w:r>
+            <w:proofErr w:type="spellEnd"/>
+            <w:r>
+              <w:t>, Sentry</w:t>
             </w:r>
           </w:p>
         </w:tc>
@@ -17566,8 +18283,13 @@
                 <w:bCs/>
               </w:rPr>
             </w:pPr>
-            <w:r>
-              <w:t>LangSmith, Weights &amp; Biases</w:t>
+            <w:proofErr w:type="spellStart"/>
+            <w:r>
+              <w:t>LangSmith</w:t>
+            </w:r>
+            <w:proofErr w:type="spellEnd"/>
+            <w:r>
+              <w:t>, Weights &amp; Biases</w:t>
             </w:r>
           </w:p>
         </w:tc>
@@ -18000,9 +18722,19 @@
             <w:vAlign w:val="center"/>
           </w:tcPr>
           <w:p>
-            <w:r>
-              <w:t>Alertmanager, PagerDuty, Opsgenie</w:t>
-            </w:r>
+            <w:proofErr w:type="spellStart"/>
+            <w:r>
+              <w:t>Alertmanager</w:t>
+            </w:r>
+            <w:proofErr w:type="spellEnd"/>
+            <w:r>
+              <w:t xml:space="preserve">, PagerDuty, </w:t>
+            </w:r>
+            <w:proofErr w:type="spellStart"/>
+            <w:r>
+              <w:t>Opsgenie</w:t>
+            </w:r>
+            <w:proofErr w:type="spellEnd"/>
           </w:p>
         </w:tc>
         <w:tc>
@@ -18012,9 +18744,19 @@
             <w:vAlign w:val="center"/>
           </w:tcPr>
           <w:p>
-            <w:r>
-              <w:t>Alertmanager, PagerDuty, Opsgenie</w:t>
-            </w:r>
+            <w:proofErr w:type="spellStart"/>
+            <w:r>
+              <w:t>Alertmanager</w:t>
+            </w:r>
+            <w:proofErr w:type="spellEnd"/>
+            <w:r>
+              <w:t xml:space="preserve">, PagerDuty, </w:t>
+            </w:r>
+            <w:proofErr w:type="spellStart"/>
+            <w:r>
+              <w:t>Opsgenie</w:t>
+            </w:r>
+            <w:proofErr w:type="spellEnd"/>
           </w:p>
         </w:tc>
         <w:tc>
@@ -18024,9 +18766,19 @@
             <w:vAlign w:val="center"/>
           </w:tcPr>
           <w:p>
-            <w:r>
-              <w:t>Alertmanager, PagerDuty, Opsgenie</w:t>
-            </w:r>
+            <w:proofErr w:type="spellStart"/>
+            <w:r>
+              <w:t>Alertmanager</w:t>
+            </w:r>
+            <w:proofErr w:type="spellEnd"/>
+            <w:r>
+              <w:t xml:space="preserve">, PagerDuty, </w:t>
+            </w:r>
+            <w:proofErr w:type="spellStart"/>
+            <w:r>
+              <w:t>Opsgenie</w:t>
+            </w:r>
+            <w:proofErr w:type="spellEnd"/>
           </w:p>
         </w:tc>
         <w:tc>
@@ -18036,9 +18788,19 @@
             <w:vAlign w:val="center"/>
           </w:tcPr>
           <w:p>
-            <w:r>
-              <w:t>Alertmanager, PagerDuty, Opsgenie</w:t>
-            </w:r>
+            <w:proofErr w:type="spellStart"/>
+            <w:r>
+              <w:t>Alertmanager</w:t>
+            </w:r>
+            <w:proofErr w:type="spellEnd"/>
+            <w:r>
+              <w:t xml:space="preserve">, PagerDuty, </w:t>
+            </w:r>
+            <w:proofErr w:type="spellStart"/>
+            <w:r>
+              <w:t>Opsgenie</w:t>
+            </w:r>
+            <w:proofErr w:type="spellEnd"/>
           </w:p>
         </w:tc>
       </w:tr>
@@ -18167,7 +18929,15 @@
           </w:tcPr>
           <w:p>
             <w:r>
-              <w:t>Writes YAML pipelines, Dockerfiles, and Terraform code.</w:t>
+              <w:t xml:space="preserve">Writes YAML pipelines, </w:t>
+            </w:r>
+            <w:proofErr w:type="spellStart"/>
+            <w:r>
+              <w:t>Dockerfiles</w:t>
+            </w:r>
+            <w:proofErr w:type="spellEnd"/>
+            <w:r>
+              <w:t>, and Terraform code.</w:t>
             </w:r>
           </w:p>
         </w:tc>
@@ -18203,7 +18973,15 @@
           </w:tcPr>
           <w:p>
             <w:r>
-              <w:t>Expert in IaC (Terraform/CDK) and AWS.</w:t>
+              <w:t xml:space="preserve">Expert in </w:t>
+            </w:r>
+            <w:proofErr w:type="spellStart"/>
+            <w:r>
+              <w:t>IaC</w:t>
+            </w:r>
+            <w:proofErr w:type="spellEnd"/>
+            <w:r>
+              <w:t xml:space="preserve"> (Terraform/CDK) and AWS.</w:t>
             </w:r>
           </w:p>
         </w:tc>
@@ -18258,12 +19036,21 @@
                 <w:bCs/>
               </w:rPr>
             </w:pPr>
-            <w:r>
-              <w:rPr>
-                <w:b/>
-                <w:bCs/>
-              </w:rPr>
-              <w:t>Snyk AI</w:t>
+            <w:proofErr w:type="spellStart"/>
+            <w:r>
+              <w:rPr>
+                <w:b/>
+                <w:bCs/>
+              </w:rPr>
+              <w:t>Snyk</w:t>
+            </w:r>
+            <w:proofErr w:type="spellEnd"/>
+            <w:r>
+              <w:rPr>
+                <w:b/>
+                <w:bCs/>
+              </w:rPr>
+              <w:t xml:space="preserve"> AI</w:t>
             </w:r>
           </w:p>
         </w:tc>
@@ -18532,15 +19319,41 @@
                 <w:bCs/>
               </w:rPr>
             </w:pPr>
-            <w:r>
-              <w:rPr>
-                <w:b/>
-                <w:bCs/>
-              </w:rPr>
-              <w:t>CMake + Conan/vcpkg</w:t>
-            </w:r>
-            <w:r>
-              <w:t xml:space="preserve"> is the gold standard. Bazel for massive monorepos.</w:t>
+            <w:proofErr w:type="spellStart"/>
+            <w:r>
+              <w:rPr>
+                <w:b/>
+                <w:bCs/>
+              </w:rPr>
+              <w:t>CMake</w:t>
+            </w:r>
+            <w:proofErr w:type="spellEnd"/>
+            <w:r>
+              <w:rPr>
+                <w:b/>
+                <w:bCs/>
+              </w:rPr>
+              <w:t xml:space="preserve"> + Conan/</w:t>
+            </w:r>
+            <w:proofErr w:type="spellStart"/>
+            <w:r>
+              <w:rPr>
+                <w:b/>
+                <w:bCs/>
+              </w:rPr>
+              <w:t>vcpkg</w:t>
+            </w:r>
+            <w:proofErr w:type="spellEnd"/>
+            <w:r>
+              <w:t xml:space="preserve"> is the gold standard. Bazel for massive </w:t>
+            </w:r>
+            <w:proofErr w:type="spellStart"/>
+            <w:r>
+              <w:t>monorepos</w:t>
+            </w:r>
+            <w:proofErr w:type="spellEnd"/>
+            <w:r>
+              <w:t>.</w:t>
             </w:r>
           </w:p>
         </w:tc>
@@ -18567,13 +19380,31 @@
             <w:r>
               <w:t xml:space="preserve"> for unit tests. </w:t>
             </w:r>
-            <w:r>
-              <w:rPr>
-                <w:b/>
-                <w:bCs/>
-              </w:rPr>
-              <w:t>Valgrind &amp; AddressSanitizer</w:t>
-            </w:r>
+            <w:proofErr w:type="spellStart"/>
+            <w:r>
+              <w:rPr>
+                <w:b/>
+                <w:bCs/>
+              </w:rPr>
+              <w:t>Valgrind</w:t>
+            </w:r>
+            <w:proofErr w:type="spellEnd"/>
+            <w:r>
+              <w:rPr>
+                <w:b/>
+                <w:bCs/>
+              </w:rPr>
+              <w:t xml:space="preserve"> &amp; </w:t>
+            </w:r>
+            <w:proofErr w:type="spellStart"/>
+            <w:r>
+              <w:rPr>
+                <w:b/>
+                <w:bCs/>
+              </w:rPr>
+              <w:t>AddressSanitizer</w:t>
+            </w:r>
+            <w:proofErr w:type="spellEnd"/>
             <w:r>
               <w:t xml:space="preserve"> for memory debugging.</w:t>
             </w:r>
@@ -18638,7 +19469,15 @@
               <w:t>build speed</w:t>
             </w:r>
             <w:r>
-              <w:t xml:space="preserve"> (Ninja, ccache) and </w:t>
+              <w:t xml:space="preserve"> (Ninja, </w:t>
+            </w:r>
+            <w:proofErr w:type="spellStart"/>
+            <w:r>
+              <w:t>ccache</w:t>
+            </w:r>
+            <w:proofErr w:type="spellEnd"/>
+            <w:r>
+              <w:t xml:space="preserve">) and </w:t>
             </w:r>
             <w:r>
               <w:rPr>
@@ -18699,6 +19538,7 @@
             <w:r>
               <w:t xml:space="preserve"> is modern standard. </w:t>
             </w:r>
+            <w:proofErr w:type="spellStart"/>
             <w:r>
               <w:rPr>
                 <w:b/>
@@ -18706,6 +19546,7 @@
               </w:rPr>
               <w:t>Setuptools</w:t>
             </w:r>
+            <w:proofErr w:type="spellEnd"/>
             <w:r>
               <w:t xml:space="preserve"> for legacy.</w:t>
             </w:r>
@@ -18724,6 +19565,7 @@
                 <w:bCs/>
               </w:rPr>
             </w:pPr>
+            <w:proofErr w:type="spellStart"/>
             <w:r>
               <w:rPr>
                 <w:b/>
@@ -18731,6 +19573,7 @@
               </w:rPr>
               <w:t>pytest</w:t>
             </w:r>
+            <w:proofErr w:type="spellEnd"/>
             <w:r>
               <w:t xml:space="preserve"> is the undisputed king. </w:t>
             </w:r>
@@ -18819,7 +19662,15 @@
               <w:t>cloud SDKs</w:t>
             </w:r>
             <w:r>
-              <w:t xml:space="preserve"> (boto3, kubernetes client).</w:t>
+              <w:t xml:space="preserve"> (boto3, </w:t>
+            </w:r>
+            <w:proofErr w:type="spellStart"/>
+            <w:r>
+              <w:t>kubernetes</w:t>
+            </w:r>
+            <w:proofErr w:type="spellEnd"/>
+            <w:r>
+              <w:t xml:space="preserve"> client).</w:t>
             </w:r>
           </w:p>
         </w:tc>
@@ -18870,6 +19721,7 @@
             <w:r>
               <w:t xml:space="preserve"> is now #1 (98% usage). </w:t>
             </w:r>
+            <w:proofErr w:type="spellStart"/>
             <w:r>
               <w:rPr>
                 <w:b/>
@@ -18877,6 +19729,7 @@
               </w:rPr>
               <w:t>esbuild</w:t>
             </w:r>
+            <w:proofErr w:type="spellEnd"/>
             <w:r>
               <w:t xml:space="preserve"> (88%) and </w:t>
             </w:r>
@@ -18915,6 +19768,7 @@
             <w:r>
               <w:t xml:space="preserve"> is most popular. </w:t>
             </w:r>
+            <w:proofErr w:type="spellStart"/>
             <w:r>
               <w:rPr>
                 <w:b/>
@@ -18922,6 +19776,7 @@
               </w:rPr>
               <w:t>Vitest</w:t>
             </w:r>
+            <w:proofErr w:type="spellEnd"/>
             <w:r>
               <w:t xml:space="preserve"> is gaining fast.</w:t>
             </w:r>
@@ -18960,12 +19815,21 @@
             <w:r>
               <w:t xml:space="preserve"> dominate. </w:t>
             </w:r>
-            <w:r>
-              <w:rPr>
-                <w:b/>
-                <w:bCs/>
-              </w:rPr>
-              <w:t>Vercel/Netlify</w:t>
+            <w:proofErr w:type="spellStart"/>
+            <w:r>
+              <w:rPr>
+                <w:b/>
+                <w:bCs/>
+              </w:rPr>
+              <w:t>Vercel</w:t>
+            </w:r>
+            <w:proofErr w:type="spellEnd"/>
+            <w:r>
+              <w:rPr>
+                <w:b/>
+                <w:bCs/>
+              </w:rPr>
+              <w:t>/Netlify</w:t>
             </w:r>
             <w:r>
               <w:t xml:space="preserve"> for frontend hosting.</w:t>
@@ -19086,6 +19950,7 @@
                 <w:bCs/>
               </w:rPr>
             </w:pPr>
+            <w:proofErr w:type="spellStart"/>
             <w:r>
               <w:rPr>
                 <w:b/>
@@ -19093,6 +19958,7 @@
               </w:rPr>
               <w:t>pytest</w:t>
             </w:r>
+            <w:proofErr w:type="spellEnd"/>
             <w:r>
               <w:t xml:space="preserve"> for code. </w:t>
             </w:r>
@@ -19151,6 +20017,7 @@
             <w:r>
               <w:t xml:space="preserve">, </w:t>
             </w:r>
+            <w:proofErr w:type="spellStart"/>
             <w:r>
               <w:rPr>
                 <w:b/>
@@ -19158,6 +20025,7 @@
               </w:rPr>
               <w:t>MLflow</w:t>
             </w:r>
+            <w:proofErr w:type="spellEnd"/>
             <w:r>
               <w:t xml:space="preserve"> for ML pipelines.</w:t>
             </w:r>
@@ -19170,6 +20038,7 @@
             <w:vAlign w:val="center"/>
           </w:tcPr>
           <w:p>
+            <w:proofErr w:type="spellStart"/>
             <w:r>
               <w:rPr>
                 <w:b/>
@@ -19177,6 +20046,7 @@
               </w:rPr>
               <w:t>MLOps</w:t>
             </w:r>
+            <w:proofErr w:type="spellEnd"/>
             <w:r>
               <w:t xml:space="preserve"> is a superset of DevOps. Key additions: </w:t>
             </w:r>
@@ -19198,7 +20068,15 @@
               <w:t>Experiment Tracking</w:t>
             </w:r>
             <w:r>
-              <w:t xml:space="preserve"> (MLflow, Weights &amp; Biases), and </w:t>
+              <w:t xml:space="preserve"> (</w:t>
+            </w:r>
+            <w:proofErr w:type="spellStart"/>
+            <w:r>
+              <w:t>MLflow</w:t>
+            </w:r>
+            <w:proofErr w:type="spellEnd"/>
+            <w:r>
+              <w:t xml:space="preserve">, Weights &amp; Biases), and </w:t>
             </w:r>
             <w:r>
               <w:rPr>
@@ -19208,7 +20086,15 @@
               <w:t>Data Versioning</w:t>
             </w:r>
             <w:r>
-              <w:t xml:space="preserve"> (DVC, LakeFS).</w:t>
+              <w:t xml:space="preserve"> (DVC, </w:t>
+            </w:r>
+            <w:proofErr w:type="spellStart"/>
+            <w:r>
+              <w:t>LakeFS</w:t>
+            </w:r>
+            <w:proofErr w:type="spellEnd"/>
+            <w:r>
+              <w:t>).</w:t>
             </w:r>
           </w:p>
         </w:tc>
@@ -19435,8 +20321,21 @@
             <w:vAlign w:val="center"/>
           </w:tcPr>
           <w:p>
-            <w:r>
-              <w:t>CMake/Conan (C++), Poetry/pytest (Python), Vite/Jest (JS)</w:t>
+            <w:proofErr w:type="spellStart"/>
+            <w:r>
+              <w:t>CMake</w:t>
+            </w:r>
+            <w:proofErr w:type="spellEnd"/>
+            <w:r>
+              <w:t>/Conan (C++), Poetry/</w:t>
+            </w:r>
+            <w:proofErr w:type="spellStart"/>
+            <w:r>
+              <w:t>pytest</w:t>
+            </w:r>
+            <w:proofErr w:type="spellEnd"/>
+            <w:r>
+              <w:t xml:space="preserve"> (Python), Vite/Jest (JS)</w:t>
             </w:r>
           </w:p>
         </w:tc>
@@ -19532,7 +20431,23 @@
           </w:tcPr>
           <w:p>
             <w:r>
-              <w:t>Conan/vcpkg, pip/Poetry, npm/yarn</w:t>
+              <w:t>Conan/</w:t>
+            </w:r>
+            <w:proofErr w:type="spellStart"/>
+            <w:r>
+              <w:t>vcpkg</w:t>
+            </w:r>
+            <w:proofErr w:type="spellEnd"/>
+            <w:r>
+              <w:t xml:space="preserve">, pip/Poetry, </w:t>
+            </w:r>
+            <w:proofErr w:type="spellStart"/>
+            <w:r>
+              <w:t>npm</w:t>
+            </w:r>
+            <w:proofErr w:type="spellEnd"/>
+            <w:r>
+              <w:t>/yarn</w:t>
             </w:r>
           </w:p>
         </w:tc>
@@ -19579,9 +20494,27 @@
             <w:vAlign w:val="center"/>
           </w:tcPr>
           <w:p>
-            <w:r>
-              <w:t>CMake/Ninja, Vite/esbuild, Setuptools</w:t>
-            </w:r>
+            <w:proofErr w:type="spellStart"/>
+            <w:r>
+              <w:t>CMake</w:t>
+            </w:r>
+            <w:proofErr w:type="spellEnd"/>
+            <w:r>
+              <w:t>/Ninja, Vite/</w:t>
+            </w:r>
+            <w:proofErr w:type="spellStart"/>
+            <w:r>
+              <w:t>esbuild</w:t>
+            </w:r>
+            <w:proofErr w:type="spellEnd"/>
+            <w:r>
+              <w:t xml:space="preserve">, </w:t>
+            </w:r>
+            <w:proofErr w:type="spellStart"/>
+            <w:r>
+              <w:t>Setuptools</w:t>
+            </w:r>
+            <w:proofErr w:type="spellEnd"/>
           </w:p>
         </w:tc>
       </w:tr>
@@ -19659,12 +20592,21 @@
                 <w:bCs/>
               </w:rPr>
             </w:pPr>
-            <w:r>
-              <w:rPr>
-                <w:b/>
-                <w:bCs/>
-              </w:rPr>
-              <w:t>IaC + Cloud</w:t>
+            <w:proofErr w:type="spellStart"/>
+            <w:r>
+              <w:rPr>
+                <w:b/>
+                <w:bCs/>
+              </w:rPr>
+              <w:t>IaC</w:t>
+            </w:r>
+            <w:proofErr w:type="spellEnd"/>
+            <w:r>
+              <w:rPr>
+                <w:b/>
+                <w:bCs/>
+              </w:rPr>
+              <w:t xml:space="preserve"> + Cloud</w:t>
             </w:r>
           </w:p>
         </w:tc>
@@ -19724,7 +20666,15 @@
           </w:tcPr>
           <w:p>
             <w:r>
-              <w:t>Google Test, pytest, Jest</w:t>
+              <w:t xml:space="preserve">Google Test, </w:t>
+            </w:r>
+            <w:proofErr w:type="spellStart"/>
+            <w:r>
+              <w:t>pytest</w:t>
+            </w:r>
+            <w:proofErr w:type="spellEnd"/>
+            <w:r>
+              <w:t>, Jest</w:t>
             </w:r>
           </w:p>
         </w:tc>
@@ -19772,7 +20722,23 @@
           </w:tcPr>
           <w:p>
             <w:r>
-              <w:t>GDB/Valgrind, pdb/Sentry, Jaeger/Zipkin</w:t>
+              <w:t>GDB/</w:t>
+            </w:r>
+            <w:proofErr w:type="spellStart"/>
+            <w:r>
+              <w:t>Valgrind</w:t>
+            </w:r>
+            <w:proofErr w:type="spellEnd"/>
+            <w:r>
+              <w:t xml:space="preserve">, </w:t>
+            </w:r>
+            <w:proofErr w:type="spellStart"/>
+            <w:r>
+              <w:t>pdb</w:t>
+            </w:r>
+            <w:proofErr w:type="spellEnd"/>
+            <w:r>
+              <w:t>/Sentry, Jaeger/Zipkin</w:t>
             </w:r>
           </w:p>
         </w:tc>
@@ -20004,14 +20970,22 @@
         <w:t>complete, language-specific roadmap</w:t>
       </w:r>
       <w:r>
-        <w:t xml:space="preserve"> for mastering DevOps in 2025. Would you like me to go deeper into any specific category (e.g., how to set up a CI/CD pipeline for C++ with CMake + GitHub Actions)?</w:t>
+        <w:t xml:space="preserve"> for mastering DevOps in 2025. Would you like me to go deeper into any specific category (e.g., how to set up a CI/CD pipeline for C++ with </w:t>
+      </w:r>
+      <w:proofErr w:type="spellStart"/>
+      <w:r>
+        <w:t>CMake</w:t>
+      </w:r>
+      <w:proofErr w:type="spellEnd"/>
+      <w:r>
+        <w:t xml:space="preserve"> + GitHub Actions)?</w:t>
       </w:r>
     </w:p>
     <w:p/>
     <w:p/>
     <w:p>
       <w:pPr>
-        <w:pStyle w:val="Heading1"/>
+        <w:pStyle w:val="Heading2"/>
         <w:rPr>
           <w:b/>
           <w:bCs/>
@@ -20424,7 +21398,23 @@
           <w:b/>
           <w:bCs/>
         </w:rPr>
-        <w:t>Chain-of-Thought (CoT) Prompting</w:t>
+        <w:t>Chain-of-Thought (</w:t>
+      </w:r>
+      <w:proofErr w:type="spellStart"/>
+      <w:r>
+        <w:rPr>
+          <w:b/>
+          <w:bCs/>
+        </w:rPr>
+        <w:t>CoT</w:t>
+      </w:r>
+      <w:proofErr w:type="spellEnd"/>
+      <w:r>
+        <w:rPr>
+          <w:b/>
+          <w:bCs/>
+        </w:rPr>
+        <w:t>) Prompting</w:t>
       </w:r>
       <w:r>
         <w:t>: Asking the AI to "think step-by-step" to solve a complex problem.</w:t>
@@ -20546,7 +21536,15 @@
         <w:t>Make</w:t>
       </w:r>
       <w:r>
-        <w:t xml:space="preserve"> (formerly Integromat). These tools allow you to connect AI to hundreds of other apps and services, creating powerful, multi-step automations.</w:t>
+        <w:t xml:space="preserve"> (formerly </w:t>
+      </w:r>
+      <w:proofErr w:type="spellStart"/>
+      <w:r>
+        <w:t>Integromat</w:t>
+      </w:r>
+      <w:proofErr w:type="spellEnd"/>
+      <w:r>
+        <w:t>). These tools allow you to connect AI to hundreds of other apps and services, creating powerful, multi-step automations.</w:t>
       </w:r>
     </w:p>
     <w:p>
@@ -20715,6 +21713,7 @@
       <w:r>
         <w:t xml:space="preserve">Use </w:t>
       </w:r>
+      <w:proofErr w:type="spellStart"/>
       <w:r>
         <w:rPr>
           <w:b/>
@@ -20722,6 +21721,7 @@
         </w:rPr>
         <w:t>Pydantic</w:t>
       </w:r>
+      <w:proofErr w:type="spellEnd"/>
       <w:r>
         <w:t xml:space="preserve"> to validate and enforce the structure and quality of the AI's output, ensuring it's always in a predictable format.</w:t>
       </w:r>
@@ -20777,6 +21777,7 @@
           <w:numId w:val="19"/>
         </w:numPr>
       </w:pPr>
+      <w:proofErr w:type="spellStart"/>
       <w:r>
         <w:rPr>
           <w:b/>
@@ -20784,6 +21785,7 @@
         </w:rPr>
         <w:t>PromptForge</w:t>
       </w:r>
+      <w:proofErr w:type="spellEnd"/>
       <w:r>
         <w:t>: A TypeScript SDK for designing, optimizing, versioning, and evaluating prompts.</w:t>
       </w:r>
@@ -21031,12 +22033,150 @@
     </w:p>
     <w:p/>
     <w:p/>
-    <w:p/>
-    <w:p/>
-    <w:p/>
-    <w:p/>
-    <w:p/>
-    <w:p/>
+    <w:p>
+      <w:pPr>
+        <w:pStyle w:val="Heading2"/>
+        <w:rPr>
+          <w:b/>
+          <w:bCs/>
+          <w:color w:val="C00000"/>
+        </w:rPr>
+      </w:pPr>
+      <w:r>
+        <w:rPr>
+          <w:b/>
+          <w:bCs/>
+          <w:color w:val="C00000"/>
+        </w:rPr>
+        <w:t xml:space="preserve">Linux Bible (The Comprehensive, Tutorial Resource) </w:t>
+      </w:r>
+    </w:p>
+    <w:p>
+      <w:pPr>
+        <w:pStyle w:val="Heading2"/>
+        <w:rPr>
+          <w:b/>
+          <w:bCs/>
+          <w:color w:val="C00000"/>
+        </w:rPr>
+      </w:pPr>
+      <w:r>
+        <w:rPr>
+          <w:b/>
+          <w:bCs/>
+          <w:color w:val="C00000"/>
+        </w:rPr>
+        <w:t xml:space="preserve">Professional CMAKE (A Practical Guide) </w:t>
+      </w:r>
+    </w:p>
+    <w:p>
+      <w:pPr>
+        <w:pStyle w:val="Heading2"/>
+        <w:rPr>
+          <w:b/>
+          <w:bCs/>
+          <w:color w:val="C00000"/>
+        </w:rPr>
+      </w:pPr>
+      <w:r>
+        <w:rPr>
+          <w:b/>
+          <w:bCs/>
+          <w:color w:val="C00000"/>
+        </w:rPr>
+        <w:t xml:space="preserve">Cloud Computing and Virtualization </w:t>
+      </w:r>
+    </w:p>
+    <w:p>
+      <w:pPr>
+        <w:pStyle w:val="Heading2"/>
+        <w:rPr>
+          <w:b/>
+          <w:bCs/>
+          <w:color w:val="C00000"/>
+        </w:rPr>
+      </w:pPr>
+      <w:r>
+        <w:rPr>
+          <w:b/>
+          <w:bCs/>
+          <w:color w:val="C00000"/>
+        </w:rPr>
+        <w:t>Pro Git</w:t>
+      </w:r>
+    </w:p>
+    <w:p>
+      <w:pPr>
+        <w:pStyle w:val="Heading2"/>
+        <w:rPr>
+          <w:b/>
+          <w:bCs/>
+          <w:color w:val="C00000"/>
+        </w:rPr>
+      </w:pPr>
+      <w:r>
+        <w:rPr>
+          <w:b/>
+          <w:bCs/>
+          <w:color w:val="C00000"/>
+        </w:rPr>
+        <w:t xml:space="preserve">The Docker Book (Containerization is the New Virtualization) </w:t>
+      </w:r>
+    </w:p>
+    <w:p>
+      <w:pPr>
+        <w:pStyle w:val="Heading2"/>
+        <w:rPr>
+          <w:b/>
+          <w:bCs/>
+          <w:color w:val="C00000"/>
+        </w:rPr>
+      </w:pPr>
+      <w:r>
+        <w:rPr>
+          <w:b/>
+          <w:bCs/>
+          <w:color w:val="C00000"/>
+        </w:rPr>
+        <w:t xml:space="preserve">CI/CD with KUBERNETES </w:t>
+      </w:r>
+    </w:p>
+    <w:p>
+      <w:pPr>
+        <w:pStyle w:val="Heading2"/>
+        <w:rPr>
+          <w:b/>
+          <w:bCs/>
+          <w:color w:val="C00000"/>
+        </w:rPr>
+      </w:pPr>
+      <w:r>
+        <w:rPr>
+          <w:b/>
+          <w:bCs/>
+          <w:color w:val="C00000"/>
+        </w:rPr>
+        <w:t xml:space="preserve">Jenkins: The Definitive Guide </w:t>
+      </w:r>
+    </w:p>
+    <w:p>
+      <w:pPr>
+        <w:pStyle w:val="Heading2"/>
+        <w:rPr>
+          <w:b/>
+          <w:bCs/>
+          <w:color w:val="C00000"/>
+        </w:rPr>
+      </w:pPr>
+      <w:r>
+        <w:rPr>
+          <w:b/>
+          <w:bCs/>
+          <w:color w:val="C00000"/>
+        </w:rPr>
+        <w:t>Practicing Continuous Integration and Continuous Delivery on AWS</w:t>
+      </w:r>
+    </w:p>
     <w:p/>
     <w:p/>
     <w:p/>
@@ -21045,7 +22185,7 @@
     <w:p/>
     <w:p>
       <w:pPr>
-        <w:pStyle w:val="Heading1"/>
+        <w:pStyle w:val="Heading2"/>
         <w:rPr>
           <w:b/>
           <w:bCs/>
@@ -22101,7 +23241,15 @@
           </w:tcPr>
           <w:p>
             <w:r>
-              <w:t>Case Study 3: Innovartus Technologies Inc.</w:t>
+              <w:t xml:space="preserve">Case Study 3: </w:t>
+            </w:r>
+            <w:proofErr w:type="spellStart"/>
+            <w:r>
+              <w:t>Innovartus</w:t>
+            </w:r>
+            <w:proofErr w:type="spellEnd"/>
+            <w:r>
+              <w:t xml:space="preserve"> Technologies Inc.</w:t>
             </w:r>
           </w:p>
         </w:tc>
@@ -25568,7 +26716,15 @@
           </w:tcPr>
           <w:p>
             <w:r>
-              <w:t xml:space="preserve">SLA Monitor  | Case Study Example – Topics 2 </w:t>
+              <w:t xml:space="preserve">SLA </w:t>
+            </w:r>
+            <w:proofErr w:type="gramStart"/>
+            <w:r>
+              <w:t>Monitor  |</w:t>
+            </w:r>
+            <w:proofErr w:type="gramEnd"/>
+            <w:r>
+              <w:t xml:space="preserve"> Case Study Example – Topics 2 </w:t>
             </w:r>
           </w:p>
         </w:tc>
@@ -28121,150 +29277,16 @@
     </w:tbl>
     <w:p/>
     <w:p/>
-    <w:p>
-      <w:pPr>
-        <w:pStyle w:val="Heading1"/>
-        <w:rPr>
-          <w:b/>
-          <w:bCs/>
-          <w:color w:val="C00000"/>
-        </w:rPr>
-      </w:pPr>
-      <w:r>
-        <w:rPr>
-          <w:b/>
-          <w:bCs/>
-          <w:color w:val="C00000"/>
-        </w:rPr>
-        <w:t xml:space="preserve">Linux Bible (The Comprehensive, Tutorial Resource) </w:t>
-      </w:r>
-    </w:p>
-    <w:p>
-      <w:pPr>
-        <w:pStyle w:val="Heading1"/>
-        <w:rPr>
-          <w:b/>
-          <w:bCs/>
-          <w:color w:val="C00000"/>
-        </w:rPr>
-      </w:pPr>
-      <w:r>
-        <w:rPr>
-          <w:b/>
-          <w:bCs/>
-          <w:color w:val="C00000"/>
-        </w:rPr>
-        <w:t xml:space="preserve">Professional CMAKE (A Practical Guide) </w:t>
-      </w:r>
-    </w:p>
-    <w:p>
-      <w:pPr>
-        <w:pStyle w:val="Heading1"/>
-        <w:rPr>
-          <w:b/>
-          <w:bCs/>
-          <w:color w:val="C00000"/>
-        </w:rPr>
-      </w:pPr>
-      <w:r>
-        <w:rPr>
-          <w:b/>
-          <w:bCs/>
-          <w:color w:val="C00000"/>
-        </w:rPr>
-        <w:t xml:space="preserve">Cloud Computing and Virtualization </w:t>
-      </w:r>
-    </w:p>
-    <w:p>
-      <w:pPr>
-        <w:pStyle w:val="Heading1"/>
-        <w:rPr>
-          <w:b/>
-          <w:bCs/>
-          <w:color w:val="C00000"/>
-        </w:rPr>
-      </w:pPr>
-      <w:r>
-        <w:rPr>
-          <w:b/>
-          <w:bCs/>
-          <w:color w:val="C00000"/>
-        </w:rPr>
-        <w:t>Pro Git</w:t>
-      </w:r>
-    </w:p>
-    <w:p>
-      <w:pPr>
-        <w:pStyle w:val="Heading1"/>
-        <w:rPr>
-          <w:b/>
-          <w:bCs/>
-          <w:color w:val="C00000"/>
-        </w:rPr>
-      </w:pPr>
-      <w:r>
-        <w:rPr>
-          <w:b/>
-          <w:bCs/>
-          <w:color w:val="C00000"/>
-        </w:rPr>
-        <w:t xml:space="preserve">The Docker Book (Containerization is the New Virtualization) </w:t>
-      </w:r>
-    </w:p>
-    <w:p>
-      <w:pPr>
-        <w:pStyle w:val="Heading1"/>
-        <w:rPr>
-          <w:b/>
-          <w:bCs/>
-          <w:color w:val="C00000"/>
-        </w:rPr>
-      </w:pPr>
-      <w:r>
-        <w:rPr>
-          <w:b/>
-          <w:bCs/>
-          <w:color w:val="C00000"/>
-        </w:rPr>
-        <w:t xml:space="preserve">CI/CD with KUBERNETES </w:t>
-      </w:r>
-    </w:p>
-    <w:p>
-      <w:pPr>
-        <w:pStyle w:val="Heading1"/>
-        <w:rPr>
-          <w:b/>
-          <w:bCs/>
-          <w:color w:val="C00000"/>
-        </w:rPr>
-      </w:pPr>
-      <w:r>
-        <w:rPr>
-          <w:b/>
-          <w:bCs/>
-          <w:color w:val="C00000"/>
-        </w:rPr>
-        <w:t xml:space="preserve">Jenkins: The Definitive Guide </w:t>
-      </w:r>
-    </w:p>
-    <w:p>
-      <w:pPr>
-        <w:pStyle w:val="Heading1"/>
-        <w:rPr>
-          <w:b/>
-          <w:bCs/>
-          <w:color w:val="C00000"/>
-        </w:rPr>
-      </w:pPr>
-      <w:r>
-        <w:rPr>
-          <w:b/>
-          <w:bCs/>
-          <w:color w:val="C00000"/>
-        </w:rPr>
-        <w:t>Practicing Continuous Integration and Continuous Delivery on AWS</w:t>
-      </w:r>
-    </w:p>
+    <w:p/>
+    <w:p/>
+    <w:p/>
+    <w:p/>
+    <w:p/>
+    <w:p/>
+    <w:p/>
+    <w:p/>
+    <w:p/>
+    <w:p/>
     <w:p/>
     <w:p/>
     <w:p>
@@ -29071,8 +30093,13 @@
             <w:shd w:val="clear" w:color="auto" w:fill="E7E6E6" w:themeFill="background2"/>
           </w:tcPr>
           <w:p>
-            <w:r>
-              <w:t>Deskchecks – Topics 3</w:t>
+            <w:proofErr w:type="spellStart"/>
+            <w:r>
+              <w:t>Deskchecks</w:t>
+            </w:r>
+            <w:proofErr w:type="spellEnd"/>
+            <w:r>
+              <w:t xml:space="preserve"> – Topics 3</w:t>
             </w:r>
           </w:p>
         </w:tc>
@@ -30591,8 +31618,13 @@
             <w:shd w:val="clear" w:color="auto" w:fill="E7E6E6" w:themeFill="background2"/>
           </w:tcPr>
           <w:p>
-            <w:r>
-              <w:t xml:space="preserve">Genomica Results </w:t>
+            <w:proofErr w:type="spellStart"/>
+            <w:r>
+              <w:t>Genomica</w:t>
+            </w:r>
+            <w:proofErr w:type="spellEnd"/>
+            <w:r>
+              <w:t xml:space="preserve"> Results </w:t>
             </w:r>
           </w:p>
         </w:tc>
@@ -35675,7 +36707,15 @@
           </w:tcPr>
           <w:p>
             <w:r>
-              <w:t xml:space="preserve">What is Requirements Engineering? </w:t>
+              <w:t xml:space="preserve">What </w:t>
+            </w:r>
+            <w:proofErr w:type="gramStart"/>
+            <w:r>
+              <w:t>is</w:t>
+            </w:r>
+            <w:proofErr w:type="gramEnd"/>
+            <w:r>
+              <w:t xml:space="preserve"> Requirements Engineering? </w:t>
             </w:r>
           </w:p>
         </w:tc>
@@ -36671,8 +37711,13 @@
           </w:tcPr>
           <w:p>
             <w:r>
-              <w:t>UML/SysML</w:t>
-            </w:r>
+              <w:t>UML/</w:t>
+            </w:r>
+            <w:proofErr w:type="spellStart"/>
+            <w:r>
+              <w:t>SysML</w:t>
+            </w:r>
+            <w:proofErr w:type="spellEnd"/>
           </w:p>
         </w:tc>
       </w:tr>
@@ -38161,7 +39206,15 @@
           </w:tcPr>
           <w:p>
             <w:r>
-              <w:t xml:space="preserve">What, Why, When, and How of Value Engineering </w:t>
+              <w:t xml:space="preserve">What, </w:t>
+            </w:r>
+            <w:proofErr w:type="gramStart"/>
+            <w:r>
+              <w:t>Why</w:t>
+            </w:r>
+            <w:proofErr w:type="gramEnd"/>
+            <w:r>
+              <w:t xml:space="preserve">, When, and How of Value Engineering </w:t>
             </w:r>
           </w:p>
         </w:tc>
@@ -42174,7 +43227,15 @@
           </w:tcPr>
           <w:p>
             <w:r>
-              <w:t>Web Engineering (Webe)</w:t>
+              <w:t>Web Engineering (</w:t>
+            </w:r>
+            <w:proofErr w:type="spellStart"/>
+            <w:r>
+              <w:t>Webe</w:t>
+            </w:r>
+            <w:proofErr w:type="spellEnd"/>
+            <w:r>
+              <w:t>)</w:t>
             </w:r>
           </w:p>
         </w:tc>
@@ -42496,7 +43557,15 @@
           </w:tcPr>
           <w:p>
             <w:r>
-              <w:t>Step-2: Income Tax Calculator SRS ver 1.0</w:t>
+              <w:t xml:space="preserve">Step-2: Income Tax Calculator SRS </w:t>
+            </w:r>
+            <w:proofErr w:type="spellStart"/>
+            <w:r>
+              <w:t>ver</w:t>
+            </w:r>
+            <w:proofErr w:type="spellEnd"/>
+            <w:r>
+              <w:t xml:space="preserve"> 1.0</w:t>
             </w:r>
           </w:p>
         </w:tc>
@@ -42516,7 +43585,15 @@
           </w:tcPr>
           <w:p>
             <w:r>
-              <w:t>Step-3: Verification on Income Tax Calculator SRS ver 1.0</w:t>
+              <w:t xml:space="preserve">Step-3: Verification on Income Tax Calculator SRS </w:t>
+            </w:r>
+            <w:proofErr w:type="spellStart"/>
+            <w:r>
+              <w:t>ver</w:t>
+            </w:r>
+            <w:proofErr w:type="spellEnd"/>
+            <w:r>
+              <w:t xml:space="preserve"> 1.0</w:t>
             </w:r>
           </w:p>
         </w:tc>
@@ -42536,7 +43613,15 @@
           </w:tcPr>
           <w:p>
             <w:r>
-              <w:t>Step-4: Income Tax Calculator SRS ver 2.0</w:t>
+              <w:t xml:space="preserve">Step-4: Income Tax Calculator SRS </w:t>
+            </w:r>
+            <w:proofErr w:type="spellStart"/>
+            <w:r>
+              <w:t>ver</w:t>
+            </w:r>
+            <w:proofErr w:type="spellEnd"/>
+            <w:r>
+              <w:t xml:space="preserve"> 2.0</w:t>
             </w:r>
           </w:p>
         </w:tc>
@@ -42556,7 +43641,15 @@
           </w:tcPr>
           <w:p>
             <w:r>
-              <w:t>Step-5: Verification on Income Tax Calculator SRS ver 2.0</w:t>
+              <w:t xml:space="preserve">Step-5: Verification on Income Tax Calculator SRS </w:t>
+            </w:r>
+            <w:proofErr w:type="spellStart"/>
+            <w:r>
+              <w:t>ver</w:t>
+            </w:r>
+            <w:proofErr w:type="spellEnd"/>
+            <w:r>
+              <w:t xml:space="preserve"> 2.0</w:t>
             </w:r>
           </w:p>
         </w:tc>
@@ -42576,7 +43669,15 @@
           </w:tcPr>
           <w:p>
             <w:r>
-              <w:t>Step-6: Income Tax Calculator SRS ver 3.0</w:t>
+              <w:t xml:space="preserve">Step-6: Income Tax Calculator SRS </w:t>
+            </w:r>
+            <w:proofErr w:type="spellStart"/>
+            <w:r>
+              <w:t>ver</w:t>
+            </w:r>
+            <w:proofErr w:type="spellEnd"/>
+            <w:r>
+              <w:t xml:space="preserve"> 3.0</w:t>
             </w:r>
           </w:p>
         </w:tc>
@@ -42596,7 +43697,15 @@
           </w:tcPr>
           <w:p>
             <w:r>
-              <w:t>Step-7: Black-Box Testing on Units/Modules of Income Text Calculator SRS ver 3.0</w:t>
+              <w:t xml:space="preserve">Step-7: Black-Box Testing on Units/Modules of Income Text Calculator SRS </w:t>
+            </w:r>
+            <w:proofErr w:type="spellStart"/>
+            <w:r>
+              <w:t>ver</w:t>
+            </w:r>
+            <w:proofErr w:type="spellEnd"/>
+            <w:r>
+              <w:t xml:space="preserve"> 3.0</w:t>
             </w:r>
           </w:p>
         </w:tc>
@@ -42737,7 +43846,23 @@
                 <w:b/>
                 <w:bCs/>
               </w:rPr>
-              <w:t xml:space="preserve">Agile Testing: A Practical Guide fro testers and Agile Teams </w:t>
+              <w:t xml:space="preserve">Agile Testing: A Practical Guide </w:t>
+            </w:r>
+            <w:proofErr w:type="spellStart"/>
+            <w:r>
+              <w:rPr>
+                <w:b/>
+                <w:bCs/>
+              </w:rPr>
+              <w:t>fro</w:t>
+            </w:r>
+            <w:proofErr w:type="spellEnd"/>
+            <w:r>
+              <w:rPr>
+                <w:b/>
+                <w:bCs/>
+              </w:rPr>
+              <w:t xml:space="preserve"> testers and Agile Teams </w:t>
             </w:r>
           </w:p>
         </w:tc>
@@ -42814,7 +43939,25 @@
                 <w:bCs/>
                 <w:color w:val="C00000"/>
               </w:rPr>
-              <w:t xml:space="preserve">What is Agile Testing, Anyway? </w:t>
+              <w:t xml:space="preserve">What is Agile Testing, </w:t>
+            </w:r>
+            <w:proofErr w:type="gramStart"/>
+            <w:r>
+              <w:rPr>
+                <w:b/>
+                <w:bCs/>
+                <w:color w:val="C00000"/>
+              </w:rPr>
+              <w:t>Anyway</w:t>
+            </w:r>
+            <w:proofErr w:type="gramEnd"/>
+            <w:r>
+              <w:rPr>
+                <w:b/>
+                <w:bCs/>
+                <w:color w:val="C00000"/>
+              </w:rPr>
+              <w:t xml:space="preserve">? </w:t>
             </w:r>
           </w:p>
         </w:tc>
@@ -55459,7 +56602,15 @@
           </w:tcPr>
           <w:p>
             <w:r>
-              <w:t>Ax and logaX – Topics 9</w:t>
+              <w:t xml:space="preserve">Ax and </w:t>
+            </w:r>
+            <w:proofErr w:type="spellStart"/>
+            <w:r>
+              <w:t>logaX</w:t>
+            </w:r>
+            <w:proofErr w:type="spellEnd"/>
+            <w:r>
+              <w:t xml:space="preserve"> – Topics 9</w:t>
             </w:r>
           </w:p>
         </w:tc>
@@ -55506,8 +56657,13 @@
             <w:shd w:val="clear" w:color="auto" w:fill="E7E6E6" w:themeFill="background2"/>
           </w:tcPr>
           <w:p>
-            <w:r>
-              <w:t>L’Hopital’s Rules – Topics 5</w:t>
+            <w:proofErr w:type="spellStart"/>
+            <w:r>
+              <w:t>L’Hopital’s</w:t>
+            </w:r>
+            <w:proofErr w:type="spellEnd"/>
+            <w:r>
+              <w:t xml:space="preserve"> Rules – Topics 5</w:t>
             </w:r>
           </w:p>
         </w:tc>
@@ -57985,7 +59141,15 @@
           </w:tcPr>
           <w:p>
             <w:r>
-              <w:t>Cauchy’s Mean Value Theorem and the Stronger Form of I’Hopital’s Rule</w:t>
+              <w:t xml:space="preserve">Cauchy’s Mean Value Theorem and the Stronger Form of </w:t>
+            </w:r>
+            <w:proofErr w:type="spellStart"/>
+            <w:r>
+              <w:t>I’Hopital’s</w:t>
+            </w:r>
+            <w:proofErr w:type="spellEnd"/>
+            <w:r>
+              <w:t xml:space="preserve"> Rule</w:t>
             </w:r>
           </w:p>
         </w:tc>
@@ -58399,7 +59563,15 @@
           </w:tcPr>
           <w:p>
             <w:r>
-              <w:t>Geometric Meaning of y = f(x, y). Direction Fields, Euler’s Method – Topics 2</w:t>
+              <w:t xml:space="preserve">Geometric Meaning of y = </w:t>
+            </w:r>
+            <w:proofErr w:type="gramStart"/>
+            <w:r>
+              <w:t>f(</w:t>
+            </w:r>
+            <w:proofErr w:type="gramEnd"/>
+            <w:r>
+              <w:t>x, y). Direction Fields, Euler’s Method – Topics 2</w:t>
             </w:r>
           </w:p>
         </w:tc>
@@ -58859,7 +60031,15 @@
           </w:tcPr>
           <w:p>
             <w:r>
-              <w:t xml:space="preserve">Review Questions an Problems </w:t>
+              <w:t xml:space="preserve">Review Questions </w:t>
+            </w:r>
+            <w:proofErr w:type="gramStart"/>
+            <w:r>
+              <w:t>an</w:t>
+            </w:r>
+            <w:proofErr w:type="gramEnd"/>
+            <w:r>
+              <w:t xml:space="preserve"> Problems </w:t>
             </w:r>
           </w:p>
         </w:tc>
@@ -59367,7 +60547,15 @@
           </w:tcPr>
           <w:p>
             <w:r>
-              <w:t>Legendre’s Equations. Legendre Polynomials Pn(x) – Topics 2</w:t>
+              <w:t xml:space="preserve">Legendre’s Equations. Legendre Polynomials </w:t>
+            </w:r>
+            <w:proofErr w:type="spellStart"/>
+            <w:r>
+              <w:t>Pn</w:t>
+            </w:r>
+            <w:proofErr w:type="spellEnd"/>
+            <w:r>
+              <w:t>(x) – Topics 2</w:t>
             </w:r>
           </w:p>
         </w:tc>
@@ -59415,7 +60603,15 @@
           </w:tcPr>
           <w:p>
             <w:r>
-              <w:t>Besel’s Equation. Bessel Functions Jv(x) – Topics 6</w:t>
+              <w:t xml:space="preserve">Besel’s Equation. Bessel Functions </w:t>
+            </w:r>
+            <w:proofErr w:type="spellStart"/>
+            <w:r>
+              <w:t>Jv</w:t>
+            </w:r>
+            <w:proofErr w:type="spellEnd"/>
+            <w:r>
+              <w:t>(x) – Topics 6</w:t>
             </w:r>
           </w:p>
         </w:tc>
@@ -59439,7 +60635,15 @@
           </w:tcPr>
           <w:p>
             <w:r>
-              <w:t>Bessel Functions of the Yv(x). General Solution – Topics 2</w:t>
+              <w:t xml:space="preserve">Bessel Functions of the </w:t>
+            </w:r>
+            <w:proofErr w:type="spellStart"/>
+            <w:r>
+              <w:t>Yv</w:t>
+            </w:r>
+            <w:proofErr w:type="spellEnd"/>
+            <w:r>
+              <w:t>(x). General Solution – Topics 2</w:t>
             </w:r>
           </w:p>
         </w:tc>
@@ -60243,8 +61447,13 @@
             <w:shd w:val="clear" w:color="auto" w:fill="E7E6E6" w:themeFill="background2"/>
           </w:tcPr>
           <w:p>
-            <w:r>
-              <w:t>Eigenbases, Diagonalization. Quadratic Forms – Topics 3</w:t>
+            <w:proofErr w:type="spellStart"/>
+            <w:r>
+              <w:t>Eigenbases</w:t>
+            </w:r>
+            <w:proofErr w:type="spellEnd"/>
+            <w:r>
+              <w:t>, Diagonalization. Quadratic Forms – Topics 3</w:t>
             </w:r>
           </w:p>
         </w:tc>

</xml_diff>